<commit_message>
STM32 Nucleo Documents added
</commit_message>
<xml_diff>
--- a/docs/01_Initial_Report.docx
+++ b/docs/01_Initial_Report.docx
@@ -63,39 +63,7 @@
           <w:sz w:val="20"/>
           <w:szCs w:val="20"/>
         </w:rPr>
-        <w:t xml:space="preserve">This project presents a privacy-preserving Wireless Sensor Network (WSN) for real-time occupancy and crowd flow estimation in campus public spaces such as the </w:t>
-      </w:r>
-      <w:r>
-        <w:rPr>
-          <w:rFonts w:ascii="Times New Roman" w:hAnsi="Times New Roman" w:cs="Times New Roman"/>
-          <w:sz w:val="20"/>
-          <w:szCs w:val="20"/>
-        </w:rPr>
-        <w:t xml:space="preserve">labs, </w:t>
-      </w:r>
-      <w:r>
-        <w:rPr>
-          <w:rFonts w:ascii="Times New Roman" w:hAnsi="Times New Roman" w:cs="Times New Roman"/>
-          <w:sz w:val="20"/>
-          <w:szCs w:val="20"/>
-        </w:rPr>
-        <w:t xml:space="preserve">mess, gymnasium, and badminton courts. Using a network of TelosB motes and an STM32 Nucleo-F446RE as the sensor interface, the system fuses data from three sensor </w:t>
-      </w:r>
-      <w:r>
-        <w:rPr>
-          <w:rFonts w:ascii="Times New Roman" w:hAnsi="Times New Roman" w:cs="Times New Roman"/>
-          <w:sz w:val="20"/>
-          <w:szCs w:val="20"/>
-        </w:rPr>
-        <w:t xml:space="preserve">modalities: </w:t>
-      </w:r>
-      <w:r>
-        <w:rPr>
-          <w:rFonts w:ascii="Times New Roman" w:hAnsi="Times New Roman" w:cs="Times New Roman"/>
-          <w:sz w:val="20"/>
-          <w:szCs w:val="20"/>
-        </w:rPr>
-        <w:t>millimeter-wave radar, vibration, and acoustic to compute a real-time congestion index for each monitored zone. The system implements TPSN for time synchronization and GEAR for energy-aware geographic routing to the base station.</w:t>
+        <w:t>This project presents a privacy-preserving Wireless Sensor Network (WSN) for real-time occupancy and crowd flow estimation in campus public spaces such as the labs, mess, gymnasium, and badminton courts. Using a network of TelosB motes and an STM32 Nucleo-F446RE as the sensor interface, the system fuses data from three sensor modalities: millimeter-wave radar, vibration, and acoustic to compute a real-time congestion index for each monitored zone. The system implements TPSN for time synchronization and GEAR for energy-aware geographic routing to the base station.</w:t>
       </w:r>
     </w:p>
     <w:p>
@@ -141,71 +109,7 @@
           <w:sz w:val="20"/>
           <w:szCs w:val="20"/>
         </w:rPr>
-        <w:t>Campus facilities such as dining halls, gyms, and courts are routinely overcrowded at peak hours</w:t>
-      </w:r>
-      <w:r>
-        <w:rPr>
-          <w:rFonts w:ascii="Times New Roman" w:hAnsi="Times New Roman" w:cs="Times New Roman"/>
-          <w:sz w:val="20"/>
-          <w:szCs w:val="20"/>
-        </w:rPr>
-        <w:t xml:space="preserve">. </w:t>
-      </w:r>
-      <w:r>
-        <w:rPr>
-          <w:rFonts w:ascii="Times New Roman" w:hAnsi="Times New Roman" w:cs="Times New Roman"/>
-          <w:sz w:val="20"/>
-          <w:szCs w:val="20"/>
-        </w:rPr>
-        <w:t>Camera-based systems</w:t>
-      </w:r>
-      <w:r>
-        <w:rPr>
-          <w:rFonts w:ascii="Times New Roman" w:hAnsi="Times New Roman" w:cs="Times New Roman"/>
-          <w:sz w:val="20"/>
-          <w:szCs w:val="20"/>
-        </w:rPr>
-        <w:t xml:space="preserve"> can be</w:t>
-      </w:r>
-      <w:r>
-        <w:rPr>
-          <w:rFonts w:ascii="Times New Roman" w:hAnsi="Times New Roman" w:cs="Times New Roman"/>
-          <w:sz w:val="20"/>
-          <w:szCs w:val="20"/>
-        </w:rPr>
-        <w:t xml:space="preserve"> </w:t>
-      </w:r>
-      <w:r>
-        <w:rPr>
-          <w:rFonts w:ascii="Times New Roman" w:hAnsi="Times New Roman" w:cs="Times New Roman"/>
-          <w:sz w:val="20"/>
-          <w:szCs w:val="20"/>
-        </w:rPr>
-        <w:t>effective but</w:t>
-      </w:r>
-      <w:r>
-        <w:rPr>
-          <w:rFonts w:ascii="Times New Roman" w:hAnsi="Times New Roman" w:cs="Times New Roman"/>
-          <w:sz w:val="20"/>
-          <w:szCs w:val="20"/>
-        </w:rPr>
-        <w:t xml:space="preserve"> raise significant privacy concerns and require heavy infrastructure. This project addresses that gap by deploying a WSN that estimates occupancy using only non-identifying physical signals</w:t>
-      </w:r>
-      <w:r>
-        <w:rPr>
-          <w:rFonts w:ascii="Times New Roman" w:hAnsi="Times New Roman" w:cs="Times New Roman"/>
-          <w:sz w:val="20"/>
-          <w:szCs w:val="20"/>
-        </w:rPr>
-        <w:t>:</w:t>
-      </w:r>
-      <w:r>
-        <w:rPr>
-          <w:rFonts w:ascii="Times New Roman" w:hAnsi="Times New Roman" w:cs="Times New Roman"/>
-          <w:sz w:val="20"/>
-          <w:szCs w:val="20"/>
-        </w:rPr>
-        <w:t xml:space="preserve"> sound level, floor vibration, and radar-based presence detection.</w:t>
+        <w:t>Campus facilities such as dining halls, gyms, and courts are routinely overcrowded at peak hours. Camera-based systems can be effective but raise significant privacy concerns and require heavy infrastructure. This project addresses that gap by deploying a WSN that estimates occupancy using only non-identifying physical signals: sound level, floor vibration, and radar-based presence detection.</w:t>
       </w:r>
     </w:p>
     <w:p>
@@ -223,39 +127,7 @@
           <w:sz w:val="20"/>
           <w:szCs w:val="20"/>
         </w:rPr>
-        <w:t xml:space="preserve">The system consists of 3–4 TelosB motes: one base station (BS) that aggregates data, </w:t>
-      </w:r>
-      <w:r>
-        <w:rPr>
-          <w:rFonts w:ascii="Times New Roman" w:hAnsi="Times New Roman" w:cs="Times New Roman"/>
-          <w:sz w:val="20"/>
-          <w:szCs w:val="20"/>
-        </w:rPr>
-        <w:t>and the</w:t>
-      </w:r>
-      <w:r>
-        <w:rPr>
-          <w:rFonts w:ascii="Times New Roman" w:hAnsi="Times New Roman" w:cs="Times New Roman"/>
-          <w:sz w:val="20"/>
-          <w:szCs w:val="20"/>
-        </w:rPr>
-        <w:t xml:space="preserve"> sensing mote</w:t>
-      </w:r>
-      <w:r>
-        <w:rPr>
-          <w:rFonts w:ascii="Times New Roman" w:hAnsi="Times New Roman" w:cs="Times New Roman"/>
-          <w:sz w:val="20"/>
-          <w:szCs w:val="20"/>
-        </w:rPr>
-        <w:t>s</w:t>
-      </w:r>
-      <w:r>
-        <w:rPr>
-          <w:rFonts w:ascii="Times New Roman" w:hAnsi="Times New Roman" w:cs="Times New Roman"/>
-          <w:sz w:val="20"/>
-          <w:szCs w:val="20"/>
-        </w:rPr>
-        <w:t xml:space="preserve"> interfaced to the STM32 and all sensors via UART. The STM32 reads all three sensors, computes a weighted congestion index, and forwards it to the sensing mote, which relays it to the BS over the WSN.</w:t>
+        <w:t>The system consists of 3–4 TelosB motes: one base station (BS) that aggregates data, and the sensing motes interfaced to the STM32 and all sensors via UART. The STM32 reads all three sensors, computes a weighted congestion index, and forwards it to the sensing mote, which relays it to the BS over the WSN.</w:t>
       </w:r>
     </w:p>
     <w:p>
@@ -315,15 +187,7 @@
           <w:sz w:val="20"/>
           <w:szCs w:val="20"/>
         </w:rPr>
-        <w:t xml:space="preserve"> A short-range mm-wave radar module detects the presence and movement of individuals</w:t>
-      </w:r>
-      <w:r>
-        <w:rPr>
-          <w:rFonts w:ascii="Times New Roman" w:hAnsi="Times New Roman" w:cs="Times New Roman"/>
-          <w:sz w:val="20"/>
-          <w:szCs w:val="20"/>
-        </w:rPr>
-        <w:t>.</w:t>
+        <w:t xml:space="preserve"> A short-range mm-wave radar module detects the presence and movement of individuals.</w:t>
       </w:r>
     </w:p>
     <w:p>
@@ -355,23 +219,7 @@
           <w:sz w:val="20"/>
           <w:szCs w:val="20"/>
         </w:rPr>
-        <w:t xml:space="preserve"> A vibration/shock sensor mounted on the floor or a structural surface captures </w:t>
-      </w:r>
-      <w:r>
-        <w:rPr>
-          <w:rFonts w:ascii="Times New Roman" w:hAnsi="Times New Roman" w:cs="Times New Roman"/>
-          <w:sz w:val="20"/>
-          <w:szCs w:val="20"/>
-        </w:rPr>
-        <w:t>footfall-induced micro-vibration</w:t>
-      </w:r>
-      <w:r>
-        <w:rPr>
-          <w:rFonts w:ascii="Times New Roman" w:hAnsi="Times New Roman" w:cs="Times New Roman"/>
-          <w:sz w:val="20"/>
-          <w:szCs w:val="20"/>
-        </w:rPr>
-        <w:t xml:space="preserve">. </w:t>
+        <w:t xml:space="preserve"> A vibration/shock sensor mounted on the floor or a structural surface captures footfall-induced micro-vibration. </w:t>
       </w:r>
     </w:p>
     <w:p>
@@ -702,6 +550,193 @@
           <w:szCs w:val="20"/>
         </w:rPr>
       </w:pPr>
+      <w:r>
+        <w:rPr>
+          <w:noProof/>
+        </w:rPr>
+        <mc:AlternateContent>
+          <mc:Choice Requires="wps">
+            <w:drawing>
+              <wp:anchor distT="0" distB="0" distL="114300" distR="114300" simplePos="0" relativeHeight="251663360" behindDoc="0" locked="0" layoutInCell="1" allowOverlap="1" wp14:anchorId="2A86DDBA" wp14:editId="45C37CEC">
+                <wp:simplePos x="0" y="0"/>
+                <wp:positionH relativeFrom="column">
+                  <wp:posOffset>-159385</wp:posOffset>
+                </wp:positionH>
+                <wp:positionV relativeFrom="paragraph">
+                  <wp:posOffset>2968625</wp:posOffset>
+                </wp:positionV>
+                <wp:extent cx="3337560" cy="635"/>
+                <wp:effectExtent l="0" t="0" r="0" b="0"/>
+                <wp:wrapSquare wrapText="bothSides"/>
+                <wp:docPr id="1522182771" name="Text Box 1"/>
+                <wp:cNvGraphicFramePr/>
+                <a:graphic xmlns:a="http://schemas.openxmlformats.org/drawingml/2006/main">
+                  <a:graphicData uri="http://schemas.microsoft.com/office/word/2010/wordprocessingShape">
+                    <wps:wsp>
+                      <wps:cNvSpPr txBox="1"/>
+                      <wps:spPr>
+                        <a:xfrm>
+                          <a:off x="0" y="0"/>
+                          <a:ext cx="3337560" cy="635"/>
+                        </a:xfrm>
+                        <a:prstGeom prst="rect">
+                          <a:avLst/>
+                        </a:prstGeom>
+                        <a:solidFill>
+                          <a:prstClr val="white"/>
+                        </a:solidFill>
+                        <a:ln>
+                          <a:noFill/>
+                        </a:ln>
+                      </wps:spPr>
+                      <wps:txbx>
+                        <w:txbxContent>
+                          <w:p>
+                            <w:pPr>
+                              <w:pStyle w:val="Caption"/>
+                              <w:jc w:val="center"/>
+                              <w:rPr>
+                                <w:rFonts w:ascii="Times New Roman" w:hAnsi="Times New Roman" w:cs="Times New Roman"/>
+                                <w:b/>
+                                <w:bCs/>
+                                <w:noProof/>
+                              </w:rPr>
+                            </w:pPr>
+                            <w:r>
+                              <w:t xml:space="preserve">Figure </w:t>
+                            </w:r>
+                            <w:fldSimple w:instr=" SEQ Figure \* ARABIC ">
+                              <w:r>
+                                <w:rPr>
+                                  <w:noProof/>
+                                </w:rPr>
+                                <w:t>1</w:t>
+                              </w:r>
+                            </w:fldSimple>
+                            <w:r>
+                              <w:t>: Circuit Diagram</w:t>
+                            </w:r>
+                          </w:p>
+                        </w:txbxContent>
+                      </wps:txbx>
+                      <wps:bodyPr rot="0" spcFirstLastPara="0" vertOverflow="overflow" horzOverflow="overflow" vert="horz" wrap="square" lIns="0" tIns="0" rIns="0" bIns="0" numCol="1" spcCol="0" rtlCol="0" fromWordArt="0" anchor="t" anchorCtr="0" forceAA="0" compatLnSpc="1">
+                        <a:prstTxWarp prst="textNoShape">
+                          <a:avLst/>
+                        </a:prstTxWarp>
+                        <a:spAutoFit/>
+                      </wps:bodyPr>
+                    </wps:wsp>
+                  </a:graphicData>
+                </a:graphic>
+              </wp:anchor>
+            </w:drawing>
+          </mc:Choice>
+          <mc:Fallback>
+            <w:pict>
+              <v:shapetype w14:anchorId="2A86DDBA" id="_x0000_t202" coordsize="21600,21600" o:spt="202" path="m,l,21600r21600,l21600,xe">
+                <v:stroke joinstyle="miter"/>
+                <v:path gradientshapeok="t" o:connecttype="rect"/>
+              </v:shapetype>
+              <v:shape id="Text Box 1" o:spid="_x0000_s1026" type="#_x0000_t202" style="position:absolute;left:0;text-align:left;margin-left:-12.55pt;margin-top:233.75pt;width:262.8pt;height:.05pt;z-index:251663360;visibility:visible;mso-wrap-style:square;mso-wrap-distance-left:9pt;mso-wrap-distance-top:0;mso-wrap-distance-right:9pt;mso-wrap-distance-bottom:0;mso-position-horizontal:absolute;mso-position-horizontal-relative:text;mso-position-vertical:absolute;mso-position-vertical-relative:text;v-text-anchor:top" o:gfxdata="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" stroked="f">
+                <v:textbox style="mso-fit-shape-to-text:t" inset="0,0,0,0">
+                  <w:txbxContent>
+                    <w:p>
+                      <w:pPr>
+                        <w:pStyle w:val="Caption"/>
+                        <w:jc w:val="center"/>
+                        <w:rPr>
+                          <w:rFonts w:ascii="Times New Roman" w:hAnsi="Times New Roman" w:cs="Times New Roman"/>
+                          <w:b/>
+                          <w:bCs/>
+                          <w:noProof/>
+                        </w:rPr>
+                      </w:pPr>
+                      <w:r>
+                        <w:t xml:space="preserve">Figure </w:t>
+                      </w:r>
+                      <w:fldSimple w:instr=" SEQ Figure \* ARABIC ">
+                        <w:r>
+                          <w:rPr>
+                            <w:noProof/>
+                          </w:rPr>
+                          <w:t>1</w:t>
+                        </w:r>
+                      </w:fldSimple>
+                      <w:r>
+                        <w:t>: Circuit Diagram</w:t>
+                      </w:r>
+                    </w:p>
+                  </w:txbxContent>
+                </v:textbox>
+                <w10:wrap type="square"/>
+              </v:shape>
+            </w:pict>
+          </mc:Fallback>
+        </mc:AlternateContent>
+      </w:r>
+      <w:r>
+        <w:rPr>
+          <w:rFonts w:ascii="Times New Roman" w:hAnsi="Times New Roman" w:cs="Times New Roman"/>
+          <w:b/>
+          <w:bCs/>
+          <w:noProof/>
+        </w:rPr>
+        <w:drawing>
+          <wp:anchor distT="0" distB="0" distL="114300" distR="114300" simplePos="0" relativeHeight="251661312" behindDoc="0" locked="0" layoutInCell="1" allowOverlap="1" wp14:anchorId="7C0E3979" wp14:editId="2DE640A5">
+            <wp:simplePos x="0" y="0"/>
+            <wp:positionH relativeFrom="column">
+              <wp:posOffset>-159385</wp:posOffset>
+            </wp:positionH>
+            <wp:positionV relativeFrom="paragraph">
+              <wp:posOffset>1170305</wp:posOffset>
+            </wp:positionV>
+            <wp:extent cx="3337560" cy="1741170"/>
+            <wp:effectExtent l="0" t="0" r="0" b="0"/>
+            <wp:wrapSquare wrapText="bothSides"/>
+            <wp:docPr id="2009423213" name="Picture 2"/>
+            <wp:cNvGraphicFramePr>
+              <a:graphicFrameLocks xmlns:a="http://schemas.openxmlformats.org/drawingml/2006/main" noChangeAspect="1"/>
+            </wp:cNvGraphicFramePr>
+            <a:graphic xmlns:a="http://schemas.openxmlformats.org/drawingml/2006/main">
+              <a:graphicData uri="http://schemas.openxmlformats.org/drawingml/2006/picture">
+                <pic:pic xmlns:pic="http://schemas.openxmlformats.org/drawingml/2006/picture">
+                  <pic:nvPicPr>
+                    <pic:cNvPr id="2009423213" name="Picture 2009423213"/>
+                    <pic:cNvPicPr/>
+                  </pic:nvPicPr>
+                  <pic:blipFill>
+                    <a:blip r:embed="rId5" cstate="print">
+                      <a:extLst>
+                        <a:ext uri="{28A0092B-C50C-407E-A947-70E740481C1C}">
+                          <a14:useLocalDpi xmlns:a14="http://schemas.microsoft.com/office/drawing/2010/main" val="0"/>
+                        </a:ext>
+                      </a:extLst>
+                    </a:blip>
+                    <a:stretch>
+                      <a:fillRect/>
+                    </a:stretch>
+                  </pic:blipFill>
+                  <pic:spPr>
+                    <a:xfrm>
+                      <a:off x="0" y="0"/>
+                      <a:ext cx="3337560" cy="1741170"/>
+                    </a:xfrm>
+                    <a:prstGeom prst="rect">
+                      <a:avLst/>
+                    </a:prstGeom>
+                  </pic:spPr>
+                </pic:pic>
+              </a:graphicData>
+            </a:graphic>
+            <wp14:sizeRelH relativeFrom="margin">
+              <wp14:pctWidth>0</wp14:pctWidth>
+            </wp14:sizeRelH>
+            <wp14:sizeRelV relativeFrom="margin">
+              <wp14:pctHeight>0</wp14:pctHeight>
+            </wp14:sizeRelV>
+          </wp:anchor>
+        </w:drawing>
+      </w:r>
       <w:r>
         <w:rPr>
           <w:noProof/>
@@ -757,22 +792,7 @@
                               <w:t xml:space="preserve">Figure </w:t>
                             </w:r>
                             <w:r>
-                              <w:fldChar w:fldCharType="begin"/>
-                            </w:r>
-                            <w:r>
-                              <w:instrText xml:space="preserve"> SEQ Figure \* ARABIC </w:instrText>
-                            </w:r>
-                            <w:r>
-                              <w:fldChar w:fldCharType="separate"/>
-                            </w:r>
-                            <w:r>
-                              <w:rPr>
-                                <w:noProof/>
-                              </w:rPr>
-                              <w:t>1</w:t>
-                            </w:r>
-                            <w:r>
-                              <w:fldChar w:fldCharType="end"/>
+                              <w:t>2</w:t>
                             </w:r>
                             <w:r>
                               <w:t>: Decision Flow Chart</w:t>
@@ -794,11 +814,7 @@
           </mc:Choice>
           <mc:Fallback>
             <w:pict>
-              <v:shapetype w14:anchorId="1A5571B2" id="_x0000_t202" coordsize="21600,21600" o:spt="202" path="m,l,21600r21600,l21600,xe">
-                <v:stroke joinstyle="miter"/>
-                <v:path gradientshapeok="t" o:connecttype="rect"/>
-              </v:shapetype>
-              <v:shape id="Text Box 1" o:spid="_x0000_s1026" type="#_x0000_t202" style="position:absolute;left:0;text-align:left;margin-left:266.05pt;margin-top:351.2pt;width:150.85pt;height:.05pt;z-index:251660288;visibility:visible;mso-wrap-style:square;mso-wrap-distance-left:9pt;mso-wrap-distance-top:0;mso-wrap-distance-right:9pt;mso-wrap-distance-bottom:0;mso-position-horizontal:absolute;mso-position-horizontal-relative:text;mso-position-vertical:absolute;mso-position-vertical-relative:text;v-text-anchor:top" o:gfxdata="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" stroked="f">
+              <v:shape w14:anchorId="1A5571B2" id="_x0000_s1027" type="#_x0000_t202" style="position:absolute;left:0;text-align:left;margin-left:266.05pt;margin-top:351.2pt;width:150.85pt;height:.05pt;z-index:251660288;visibility:visible;mso-wrap-style:square;mso-wrap-distance-left:9pt;mso-wrap-distance-top:0;mso-wrap-distance-right:9pt;mso-wrap-distance-bottom:0;mso-position-horizontal:absolute;mso-position-horizontal-relative:text;mso-position-vertical:absolute;mso-position-vertical-relative:text;v-text-anchor:top" o:gfxdata="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" stroked="f">
                 <v:textbox style="mso-fit-shape-to-text:t" inset="0,0,0,0">
                   <w:txbxContent>
                     <w:p>
@@ -815,22 +831,7 @@
                         <w:t xml:space="preserve">Figure </w:t>
                       </w:r>
                       <w:r>
-                        <w:fldChar w:fldCharType="begin"/>
-                      </w:r>
-                      <w:r>
-                        <w:instrText xml:space="preserve"> SEQ Figure \* ARABIC </w:instrText>
-                      </w:r>
-                      <w:r>
-                        <w:fldChar w:fldCharType="separate"/>
-                      </w:r>
-                      <w:r>
-                        <w:rPr>
-                          <w:noProof/>
-                        </w:rPr>
-                        <w:t>1</w:t>
-                      </w:r>
-                      <w:r>
-                        <w:fldChar w:fldCharType="end"/>
+                        <w:t>2</w:t>
                       </w:r>
                       <w:r>
                         <w:t>: Decision Flow Chart</w:t>
@@ -847,11 +848,12 @@
       <w:r>
         <w:rPr>
           <w:rFonts w:ascii="Times New Roman" w:hAnsi="Times New Roman" w:cs="Times New Roman"/>
+          <w:noProof/>
           <w:sz w:val="20"/>
           <w:szCs w:val="20"/>
         </w:rPr>
         <w:drawing>
-          <wp:anchor distT="0" distB="0" distL="114300" distR="114300" simplePos="0" relativeHeight="251658240" behindDoc="0" locked="0" layoutInCell="1" allowOverlap="1" wp14:anchorId="697E0BED" wp14:editId="03C2293E">
+          <wp:anchor distT="0" distB="0" distL="114300" distR="114300" simplePos="0" relativeHeight="251658240" behindDoc="0" locked="0" layoutInCell="1" allowOverlap="1" wp14:anchorId="697E0BED" wp14:editId="724A77E3">
             <wp:simplePos x="0" y="0"/>
             <wp:positionH relativeFrom="column">
               <wp:posOffset>3379139</wp:posOffset>
@@ -874,7 +876,7 @@
                     <pic:cNvPicPr/>
                   </pic:nvPicPr>
                   <pic:blipFill>
-                    <a:blip r:embed="rId5" cstate="print">
+                    <a:blip r:embed="rId6" cstate="print">
                       <a:extLst>
                         <a:ext uri="{28A0092B-C50C-407E-A947-70E740481C1C}">
                           <a14:useLocalDpi xmlns:a14="http://schemas.microsoft.com/office/drawing/2010/main" val="0"/>
@@ -2217,6 +2219,7 @@
   <w:style w:type="character" w:default="1" w:styleId="DefaultParagraphFont">
     <w:name w:val="Default Paragraph Font"/>
     <w:uiPriority w:val="1"/>
+    <w:semiHidden/>
     <w:unhideWhenUsed/>
   </w:style>
   <w:style w:type="table" w:default="1" w:styleId="TableNormal">

</xml_diff>